<commit_message>
feat: publish universal partner offer v3
</commit_message>
<xml_diff>
--- a/docs/legal/docx/05-restaurant-consent.docx
+++ b/docs/legal/docx/05-restaurant-consent.docx
@@ -8,7 +8,7 @@
         <w:jc w:val="left"/>
       </w:pPr>
       <w:r>
-        <w:t>Согласие представителя ресторана на обработку персональных данных</w:t>
+        <w:t>Согласие представителя бизнеса-партнёра на обработку персональных данных</w:t>
       </w:r>
     </w:p>
     <w:p>
@@ -30,7 +30,7 @@
         <w:t>Редакция:</w:t>
       </w:r>
       <w:r>
-        <w:t xml:space="preserve"> 1.0 от 31 июля 2026 года</w:t>
+        <w:t xml:space="preserve"> 3.0 от 18 августа 2026 года</w:t>
       </w:r>
     </w:p>
     <w:p>
@@ -52,29 +52,29 @@
         <w:t>Оператор:</w:t>
       </w:r>
       <w:r>
-        <w:t xml:space="preserve"> Абдулкадыров Дук-Ваха Магомедович, адрес: ул. Т. Л. Алиева, 69 [УКАЗАТЬ ИНДЕКС, НАСЕЛЁННЫЙ ПУНКТ, РЕГИОН], email: studiacatalog@outlook.com</w:t>
+        <w:t xml:space="preserve"> Абдулкадыров Дук-Ваха Магомедович, плательщик НПД, ИНН 200600136496, дата постановки на учёт 05.08.2026</w:t>
       </w:r>
     </w:p>
     <w:p>
-      <w:pPr>
-        <w:spacing w:before="120" w:after="160"/>
-        <w:ind w:left="255" w:right="113"/>
-      </w:pPr>
       <w:r>
         <w:rPr>
-          <w:color w:val="8B5500"/>
+          <w:b/>
         </w:rPr>
-        <w:t xml:space="preserve">Рабочий проект. До публикации необходимо удалить все метки </w:t>
+        <w:t>Адрес:</w:t>
       </w:r>
       <w:r>
+        <w:t xml:space="preserve"> Чеченская Республика, Курчалоевский район, село Цоци-Юрт, улица Т. Л. Алиева, дом 69</w:t>
+      </w:r>
+    </w:p>
+    <w:p>
+      <w:r>
         <w:rPr>
-          <w:rFonts w:ascii="Courier New" w:hAnsi="Courier New"/>
-          <w:sz w:val="18"/>
+          <w:b/>
         </w:rPr>
-        <w:t>[ЗАПОЛНИТЬ]</w:t>
+        <w:t>Контакты:</w:t>
       </w:r>
       <w:r>
-        <w:t>, подтвердить российскую инфраструктуру и получить проверку российского юриста.</w:t>
+        <w:t xml:space="preserve"> support@wayyaam.ru; вопросы персональных данных: privacy@wayyaam.ru; +7 928 886-54-70</w:t>
       </w:r>
     </w:p>
     <w:p>
@@ -87,7 +87,7 @@
     </w:p>
     <w:p>
       <w:r>
-        <w:t>Я, владелец или уполномоченный представитель заведения, идентифицируемый данными формы и договора, свободно, своей волей и в своём интересе даю оператору Абдулкадыров Дук-Ваха Магомедович согласие на обработку перечисленных ниже данных. Согласие оформляется отдельно от пользовательского соглашения или оферты.</w:t>
+        <w:t>Я, владелец или уполномоченный представитель бизнеса-партнёра, идентифицируемый данными формы и договора, свободно, своей волей и в своём интересе даю оператору Абдулкадыров Дук-Ваха Магомедович согласие на обработку перечисленных ниже данных. Согласие оформляется отдельно от пользовательского соглашения или оферты.</w:t>
       </w:r>
     </w:p>
     <w:p>
@@ -150,7 +150,7 @@
           <w:rFonts w:ascii="Courier New" w:hAnsi="Courier New"/>
           <w:sz w:val="18"/>
         </w:rPr>
-        <w:t>studiacatalog@outlook.com</w:t>
+        <w:t>privacy@wayyaam.ru</w:t>
       </w:r>
       <w:r>
         <w:t>. Отзыв не влияет на законность предыдущей обработки; оператор вправе продолжить только при наличии самостоятельного основания. При отсутствии основания данные уничтожаются в сроки закона и Регламента удаления.</w:t>
@@ -173,7 +173,7 @@
           <w:rFonts w:ascii="Courier New" w:hAnsi="Courier New"/>
           <w:sz w:val="18"/>
         </w:rPr>
-        <w:t>1.0</w:t>
+        <w:t>3.0</w:t>
       </w:r>
       <w:r>
         <w:t>, текст/хеш версии, время, источник, IP/user-agent в минимальном объёме и состояние checkbox. Предустановленный checkbox не допускается. Субъект подтверждает достоверность данных и полномочия на данные третьих лиц.</w:t>
@@ -181,7 +181,7 @@
     </w:p>
     <w:p>
       <w:r>
-        <w:t>Представитель подтверждает полномочия действовать за заведение. Сведения, обязательные для бухгалтерского и налогового учёта, сохраняются независимо от отзыва в установленный законом срок.</w:t>
+        <w:t>Представитель подтверждает полномочия действовать за Партнёра. Сведения, обязательные для бухгалтерского и налогового учёта, сохраняются независимо от отзыва в установленный законом срок.</w:t>
       </w:r>
     </w:p>
     <w:sectPr>
@@ -206,7 +206,7 @@
       <w:rPr>
         <w:sz w:val="16"/>
       </w:rPr>
-      <w:t>WayYaam · 1.0 · studiacatalog@outlook.com</w:t>
+      <w:t>WayYaam · 3.0 · privacy@wayyaam.ru</w:t>
     </w:r>
   </w:p>
 </w:ftr>
@@ -576,11 +576,11 @@
     <w:qFormat/>
     <w:rsid w:val="00FC693F"/>
     <w:pPr>
-      <w:spacing w:after="120" w:line="264" w:lineRule="auto"/>
+      <w:spacing w:after="100" w:line="252" w:lineRule="auto"/>
     </w:pPr>
     <w:rPr>
       <w:rFonts w:ascii="Arial" w:hAnsi="Arial"/>
-      <w:sz w:val="21"/>
+      <w:sz w:val="20"/>
     </w:rPr>
   </w:style>
   <w:style w:type="paragraph" w:styleId="Header">

</xml_diff>